<commit_message>
Clean Chartbeat resume and cover letter per noslops/mr-gay audit
Cut em-dash editorializing tails on two resume bullets that just
restated the metric already given. In the cover letter, replaced two
em dashes with colons, dropped a negation-reframe trailing clause,
and cut a filler adverb.

Co-Authored-By: Claude Sonnet 5 <noreply@anthropic.com>
Claude-Session: https://claude.ai/code/session_01HGwMf3WQEWpBH5LDYWi1id
</commit_message>
<xml_diff>
--- a/Taylor-Bornstein-Cover-Letter-Chartbeat.docx
+++ b/Taylor-Bornstein-Cover-Letter-Chartbeat.docx
@@ -105,7 +105,7 @@
           <w:sz w:val="22"/>
           <w:szCs w:val="22"/>
         </w:rPr>
-        <w:t xml:space="preserve">Positioned separately, they read as a bundle of tools. Positioned together, this is the one company that can publish the full content-to-revenue picture — attention, distribution, and yield in one dataset nobody else has.</w:t>
+        <w:t xml:space="preserve">Positioned separately, they read as a bundle of tools. Positioned together, this is the one company that can publish the full content-to-revenue picture: attention, distribution, and yield in one dataset no competitor has.</w:t>
       </w:r>
     </w:p>
     <w:p>
@@ -128,7 +128,7 @@
           <w:sz w:val="22"/>
           <w:szCs w:val="22"/>
         </w:rPr>
-        <w:t xml:space="preserve">Aggregated, anonymized engagement and yield data at this scale is the kind of proprietary dataset that makes news on its own — the shape of an annual State of Attention report that trade press cites on its own terms, not a survey competitors can shrug off.</w:t>
+        <w:t xml:space="preserve">Aggregated, anonymized engagement and yield data at this scale is the kind of proprietary dataset that makes news on its own: the shape of an annual State of Attention report trade press cites on its own terms.</w:t>
       </w:r>
     </w:p>
     <w:p>
@@ -151,7 +151,7 @@
           <w:sz w:val="22"/>
           <w:szCs w:val="22"/>
         </w:rPr>
-        <w:t xml:space="preserve">The audience here is publisher and media-company leadership deciding where investment goes next. Content that's actually useful to that decision earns trust a traffic number doesn't.</w:t>
+        <w:t xml:space="preserve">The audience here is publisher and media-company leadership deciding where investment goes next. Content that's useful to that decision earns trust a traffic number doesn't.</w:t>
       </w:r>
     </w:p>
     <w:p>

</xml_diff>